<commit_message>
Add thesis LaTeX sources
</commit_message>
<xml_diff>
--- a/docs/plantilla_anteproyecto.docx
+++ b/docs/plantilla_anteproyecto.docx
@@ -236,16 +236,50 @@
             <w:pPr>
               <w:pStyle w:val="TableParagraph"/>
               <w:rPr>
-                <w:sz w:val="20"/>
-                <w:lang w:val="es-ES"/>
-              </w:rPr>
-            </w:pPr>
-            <w:r>
-              <w:rPr>
-                <w:sz w:val="20"/>
-                <w:lang w:val="es-ES"/>
-              </w:rPr>
-              <w:t>XXXXXX</w:t>
+                <w:sz w:val="28"/>
+                <w:szCs w:val="28"/>
+                <w:lang w:val="es-ES"/>
+              </w:rPr>
+            </w:pPr>
+            <w:r>
+              <w:rPr>
+                <w:sz w:val="28"/>
+                <w:szCs w:val="28"/>
+                <w:lang w:val="es-ES"/>
+              </w:rPr>
+              <w:t>Generación estructurada de archivos YAML a</w:t>
+            </w:r>
+            <w:r>
+              <w:rPr>
+                <w:sz w:val="28"/>
+                <w:szCs w:val="28"/>
+                <w:lang w:val="es-ES"/>
+              </w:rPr>
+              <w:t xml:space="preserve"> </w:t>
+            </w:r>
+            <w:r>
+              <w:rPr>
+                <w:sz w:val="28"/>
+                <w:szCs w:val="28"/>
+                <w:lang w:val="es-ES"/>
+              </w:rPr>
+              <w:t>partir de lenguaje natural mediante modelos</w:t>
+            </w:r>
+            <w:r>
+              <w:rPr>
+                <w:sz w:val="28"/>
+                <w:szCs w:val="28"/>
+                <w:lang w:val="es-ES"/>
+              </w:rPr>
+              <w:t xml:space="preserve"> </w:t>
+            </w:r>
+            <w:r>
+              <w:rPr>
+                <w:sz w:val="28"/>
+                <w:szCs w:val="28"/>
+                <w:lang w:val="es-ES"/>
+              </w:rPr>
+              <w:t>de lenguaje</w:t>
             </w:r>
           </w:p>
         </w:tc>
@@ -480,8 +514,112 @@
               <w:pStyle w:val="TableParagraph"/>
               <w:rPr>
                 <w:sz w:val="20"/>
-              </w:rPr>
-            </w:pPr>
+                <w:lang w:val="es-ES"/>
+              </w:rPr>
+            </w:pPr>
+            <w:r>
+              <w:rPr>
+                <w:sz w:val="20"/>
+                <w:lang w:val="es-ES"/>
+              </w:rPr>
+              <w:t xml:space="preserve">El objetivo principal del trabajo es diseñar y evaluar un sistema basado en modelos de lenguaje capaz de generar manifiestos YAML de </w:t>
+            </w:r>
+            <w:proofErr w:type="spellStart"/>
+            <w:r>
+              <w:rPr>
+                <w:sz w:val="20"/>
+                <w:lang w:val="es-ES"/>
+              </w:rPr>
+              <w:t>Kubernetes</w:t>
+            </w:r>
+            <w:proofErr w:type="spellEnd"/>
+            <w:r>
+              <w:rPr>
+                <w:sz w:val="20"/>
+                <w:lang w:val="es-ES"/>
+              </w:rPr>
+              <w:t xml:space="preserve"> a partir de instrucciones en lenguaje natural. El proyecto busca estudiar hasta qué punto un modelo </w:t>
+            </w:r>
+            <w:proofErr w:type="spellStart"/>
+            <w:r>
+              <w:rPr>
+                <w:sz w:val="20"/>
+                <w:lang w:val="es-ES"/>
+              </w:rPr>
+              <w:t>autoregresivo</w:t>
+            </w:r>
+            <w:proofErr w:type="spellEnd"/>
+            <w:r>
+              <w:rPr>
+                <w:sz w:val="20"/>
+                <w:lang w:val="es-ES"/>
+              </w:rPr>
+              <w:t>, que genera secuencias planas de tokens, puede producir salidas con estructura jerárquica válida. Para ello, se definirá una representación intermedia basada en líneas YAML y niveles jerárquicos (</w:t>
+            </w:r>
+            <w:proofErr w:type="spellStart"/>
+            <w:r>
+              <w:rPr>
+                <w:sz w:val="20"/>
+                <w:lang w:val="es-ES"/>
+              </w:rPr>
+              <w:t>level</w:t>
+            </w:r>
+            <w:proofErr w:type="spellEnd"/>
+            <w:r>
+              <w:rPr>
+                <w:sz w:val="20"/>
+                <w:lang w:val="es-ES"/>
+              </w:rPr>
+              <w:t xml:space="preserve">). Se comparará una estrategia que serializa la jerarquía como texto con otra que predice explícitamente el nivel mediante un cabezal estructural. Además, se diseñarán métricas para evaluar </w:t>
+            </w:r>
+            <w:proofErr w:type="spellStart"/>
+            <w:r>
+              <w:rPr>
+                <w:sz w:val="20"/>
+                <w:lang w:val="es-ES"/>
+              </w:rPr>
+              <w:t>parseabilidad</w:t>
+            </w:r>
+            <w:proofErr w:type="spellEnd"/>
+            <w:r>
+              <w:rPr>
+                <w:sz w:val="20"/>
+                <w:lang w:val="es-ES"/>
+              </w:rPr>
+              <w:t xml:space="preserve">, consistencia estructural, adecuación al </w:t>
+            </w:r>
+            <w:proofErr w:type="spellStart"/>
+            <w:r>
+              <w:rPr>
+                <w:sz w:val="20"/>
+                <w:lang w:val="es-ES"/>
+              </w:rPr>
+              <w:t>prompt</w:t>
+            </w:r>
+            <w:proofErr w:type="spellEnd"/>
+            <w:r>
+              <w:rPr>
+                <w:sz w:val="20"/>
+                <w:lang w:val="es-ES"/>
+              </w:rPr>
+              <w:t xml:space="preserve"> y validez aproximada en el dominio </w:t>
+            </w:r>
+            <w:proofErr w:type="spellStart"/>
+            <w:r>
+              <w:rPr>
+                <w:sz w:val="20"/>
+                <w:lang w:val="es-ES"/>
+              </w:rPr>
+              <w:t>Kubernetes</w:t>
+            </w:r>
+            <w:proofErr w:type="spellEnd"/>
+            <w:r>
+              <w:rPr>
+                <w:sz w:val="20"/>
+                <w:lang w:val="es-ES"/>
+              </w:rPr>
+              <w:t>.</w:t>
+            </w:r>
           </w:p>
         </w:tc>
       </w:tr>
@@ -523,8 +661,96 @@
               <w:pStyle w:val="TableParagraph"/>
               <w:rPr>
                 <w:sz w:val="20"/>
-              </w:rPr>
-            </w:pPr>
+                <w:lang w:val="es-ES"/>
+              </w:rPr>
+            </w:pPr>
+            <w:r>
+              <w:rPr>
+                <w:sz w:val="20"/>
+                <w:lang w:val="es-ES"/>
+              </w:rPr>
+              <w:t xml:space="preserve">Este Trabajo Fin de Máster estudia la generación estructurada de manifiestos YAML de </w:t>
+            </w:r>
+            <w:proofErr w:type="spellStart"/>
+            <w:r>
+              <w:rPr>
+                <w:sz w:val="20"/>
+                <w:lang w:val="es-ES"/>
+              </w:rPr>
+              <w:t>Kubernetes</w:t>
+            </w:r>
+            <w:proofErr w:type="spellEnd"/>
+            <w:r>
+              <w:rPr>
+                <w:sz w:val="20"/>
+                <w:lang w:val="es-ES"/>
+              </w:rPr>
+              <w:t xml:space="preserve"> mediante modelos de lenguaje grandes. La motivación parte de una tensión clara: los </w:t>
+            </w:r>
+            <w:proofErr w:type="spellStart"/>
+            <w:r>
+              <w:rPr>
+                <w:sz w:val="20"/>
+                <w:lang w:val="es-ES"/>
+              </w:rPr>
+              <w:t>LLMs</w:t>
+            </w:r>
+            <w:proofErr w:type="spellEnd"/>
+            <w:r>
+              <w:rPr>
+                <w:sz w:val="20"/>
+                <w:lang w:val="es-ES"/>
+              </w:rPr>
+              <w:t xml:space="preserve"> generan texto de forma </w:t>
+            </w:r>
+            <w:proofErr w:type="spellStart"/>
+            <w:r>
+              <w:rPr>
+                <w:sz w:val="20"/>
+                <w:lang w:val="es-ES"/>
+              </w:rPr>
+              <w:t>autoregresiva</w:t>
+            </w:r>
+            <w:proofErr w:type="spellEnd"/>
+            <w:r>
+              <w:rPr>
+                <w:sz w:val="20"/>
+                <w:lang w:val="es-ES"/>
+              </w:rPr>
+              <w:t xml:space="preserve"> y plana, mientras que los manifiestos YAML requieren una organización jerárquica precisa para ser válidos y útiles. El trabajo propone abordar este problema mediante una representación intermedia formada por bloques de línea, donde cada línea contiene su contenido textual y un nivel jerárquico explícito. Sobre esta base, se compararán dos enfoques: uno en el que la jerarquía se aprende como parte de una salida serializada, y otro en el que se incorpora un cabezal específico para predecir el nivel estructural. El sistema utilizará un </w:t>
+            </w:r>
+            <w:proofErr w:type="spellStart"/>
+            <w:r>
+              <w:rPr>
+                <w:sz w:val="20"/>
+                <w:lang w:val="es-ES"/>
+              </w:rPr>
+              <w:t>parser</w:t>
+            </w:r>
+            <w:proofErr w:type="spellEnd"/>
+            <w:r>
+              <w:rPr>
+                <w:sz w:val="20"/>
+                <w:lang w:val="es-ES"/>
+              </w:rPr>
+              <w:t xml:space="preserve"> determinista como mecanismo de reconstrucción y control estructural, evitando que la generación final dependa únicamente de texto libre. La evaluación no se centrará en similitud textual superficial, sino en validez YAML, consistencia jerárquica, adecuación a la instrucción y señales automáticas de corrección en </w:t>
+            </w:r>
+            <w:proofErr w:type="spellStart"/>
+            <w:r>
+              <w:rPr>
+                <w:sz w:val="20"/>
+                <w:lang w:val="es-ES"/>
+              </w:rPr>
+              <w:t>Kubernetes</w:t>
+            </w:r>
+            <w:proofErr w:type="spellEnd"/>
+            <w:r>
+              <w:rPr>
+                <w:sz w:val="20"/>
+                <w:lang w:val="es-ES"/>
+              </w:rPr>
+              <w:t>.</w:t>
+            </w:r>
           </w:p>
         </w:tc>
       </w:tr>
@@ -567,6 +793,12 @@
                 <w:sz w:val="20"/>
               </w:rPr>
             </w:pPr>
+            <w:r>
+              <w:rPr>
+                <w:sz w:val="20"/>
+              </w:rPr>
+              <w:t>This Master’s Thesis studies the generation of Kubernetes YAML manifests from natural language instructions using large language models. The work starts from the mismatch between autoregressive token generation and the hierarchical structure required by YAML-based technical configurations. The project proposes an intermediate line-and-level representation and compares serialized hierarchy prediction with an explicit structural head for predicting YAML levels. Generated outputs are reconstructed through a deterministic parser and evaluated beyond text similarity, considering YAML validity, structural consistency, prompt adequacy, and Kubernetes-domain constraints.</w:t>
+            </w:r>
           </w:p>
         </w:tc>
       </w:tr>
@@ -1038,62 +1270,6 @@
         </w:tc>
       </w:tr>
     </w:tbl>
-    <w:p>
-      <w:pPr>
-        <w:rPr>
-          <w:b/>
-          <w:sz w:val="20"/>
-        </w:rPr>
-      </w:pPr>
-    </w:p>
-    <w:p>
-      <w:pPr>
-        <w:rPr>
-          <w:b/>
-          <w:sz w:val="20"/>
-        </w:rPr>
-      </w:pPr>
-    </w:p>
-    <w:p>
-      <w:pPr>
-        <w:rPr>
-          <w:b/>
-          <w:sz w:val="20"/>
-        </w:rPr>
-      </w:pPr>
-    </w:p>
-    <w:p>
-      <w:pPr>
-        <w:rPr>
-          <w:b/>
-          <w:sz w:val="20"/>
-        </w:rPr>
-      </w:pPr>
-    </w:p>
-    <w:p>
-      <w:pPr>
-        <w:rPr>
-          <w:b/>
-          <w:sz w:val="20"/>
-        </w:rPr>
-      </w:pPr>
-    </w:p>
-    <w:p>
-      <w:pPr>
-        <w:rPr>
-          <w:b/>
-          <w:sz w:val="20"/>
-        </w:rPr>
-      </w:pPr>
-    </w:p>
-    <w:p>
-      <w:pPr>
-        <w:rPr>
-          <w:b/>
-          <w:sz w:val="20"/>
-        </w:rPr>
-      </w:pPr>
-    </w:p>
     <w:p>
       <w:pPr>
         <w:spacing w:before="7"/>
@@ -1541,7 +1717,6 @@
   <w:style w:type="character" w:default="1" w:styleId="DefaultParagraphFont">
     <w:name w:val="Default Paragraph Font"/>
     <w:uiPriority w:val="1"/>
-    <w:semiHidden/>
     <w:unhideWhenUsed/>
   </w:style>
   <w:style w:type="table" w:default="1" w:styleId="TableNormal">

</xml_diff>